<commit_message>
Add CM Hub Intel Tool project to resume and web page
</commit_message>
<xml_diff>
--- a/Art_Van_de_Riet_Resume_2026.docx
+++ b/Art_Van_de_Riet_Resume_2026.docx
@@ -112,7 +112,7 @@
         <w:rPr>
           <w:color w:val="222222"/>
         </w:rPr>
-        <w:t>Python  ·  Power Automate  ·  Power Apps  ·  VBA / Excel Macros  ·  SharePoint  ·  CI/CD &amp; GitLab Runners</w:t>
+        <w:t>Python  ·  Power Automate  ·  Power Apps  ·  VBA / Excel Macros  ·  C# / Azure Functions  ·  SharePoint  ·  CI/CD &amp; GitLab Runners</w:t>
       </w:r>
     </w:p>
     <w:p>
@@ -539,6 +539,79 @@
           <w:color w:val="1F2A44"/>
           <w:sz w:val="21"/>
         </w:rPr>
+        <w:t>CM Hub Intel Tool</w:t>
+      </w:r>
+      <w:r>
+        <w:rPr>
+          <w:i/>
+          <w:color w:val="555555"/>
+          <w:sz w:val="18"/>
+        </w:rPr>
+        <w:t xml:space="preserve">   —  Python, pandas, Power Apps, Power Automate, SharePoint, C# / Azure Functions, GitLab CI/CD</w:t>
+      </w:r>
+    </w:p>
+    <w:p>
+      <w:pPr>
+        <w:pStyle w:val="ListBullet"/>
+        <w:spacing w:before="0" w:after="40"/>
+        <w:ind w:left="317" w:hanging="230"/>
+      </w:pPr>
+      <w:r>
+        <w:rPr>
+          <w:color w:val="222222"/>
+        </w:rPr>
+        <w:t>Built an end-to-end network intelligence platform that consolidates 3,916 hub records from 6 source systems, giving NOC and Change Management teams instant search access to transport maps, backbone dependencies, and risk indicators.</w:t>
+      </w:r>
+    </w:p>
+    <w:p>
+      <w:pPr>
+        <w:pStyle w:val="ListBullet"/>
+        <w:spacing w:before="0" w:after="40"/>
+        <w:ind w:left="317" w:hanging="230"/>
+      </w:pPr>
+      <w:r>
+        <w:rPr>
+          <w:color w:val="222222"/>
+        </w:rPr>
+        <w:t>Engineered a Python pipeline that parses 100+ Visio network maps and links them to hubs at a 96% match rate, replacing manual searches through a 100+ page PDF and cutting hub lookups from minutes to seconds.</w:t>
+      </w:r>
+    </w:p>
+    <w:p>
+      <w:pPr>
+        <w:pStyle w:val="ListBullet"/>
+        <w:spacing w:before="0" w:after="40"/>
+        <w:ind w:left="317" w:hanging="230"/>
+      </w:pPr>
+      <w:r>
+        <w:rPr>
+          <w:color w:val="222222"/>
+        </w:rPr>
+        <w:t>Flagged 167 backbone (BBoC) hubs and 108 single-threaded sites with automated warning banners, surfacing outage blast radius at the point of CRQ review to prevent service-impacting changes.</w:t>
+      </w:r>
+    </w:p>
+    <w:p>
+      <w:pPr>
+        <w:pStyle w:val="ListBullet"/>
+        <w:spacing w:before="0" w:after="40"/>
+        <w:ind w:left="317" w:hanging="230"/>
+      </w:pPr>
+      <w:r>
+        <w:rPr>
+          <w:color w:val="222222"/>
+        </w:rPr>
+        <w:t>Delivered the tool through a Power Apps front end backed by a SharePoint list, with a C# Azure Function automating Visio map splitting and a GitLab CI/CD pipeline.</w:t>
+      </w:r>
+    </w:p>
+    <w:p>
+      <w:pPr>
+        <w:spacing w:before="120" w:after="20"/>
+      </w:pPr>
+      <w:r>
+        <w:rPr>
+          <w:b/>
+          <w:color w:val="1F2A44"/>
+          <w:sz w:val="21"/>
+        </w:rPr>
         <w:t>STL Hub 72-Hour Buffer Analyzer</w:t>
       </w:r>
       <w:r>

</xml_diff>

<commit_message>
Add Systems Engineer II role built from Hub Intel Tool project work
</commit_message>
<xml_diff>
--- a/Art_Van_de_Riet_Resume_2026.docx
+++ b/Art_Van_de_Riet_Resume_2026.docx
@@ -203,6 +203,109 @@
           <w:color w:val="1F2A44"/>
           <w:sz w:val="22"/>
         </w:rPr>
+        <w:t>Systems Engineer II — Automation &amp; Network Intelligence</w:t>
+      </w:r>
+      <w:r>
+        <w:rPr>
+          <w:b/>
+          <w:color w:val="555555"/>
+          <w:sz w:val="19"/>
+        </w:rPr>
+        <w:tab/>
+        <w:t>Apr 2026 – Present</w:t>
+      </w:r>
+    </w:p>
+    <w:p>
+      <w:pPr>
+        <w:spacing w:before="0" w:after="40"/>
+      </w:pPr>
+      <w:r>
+        <w:rPr>
+          <w:i/>
+          <w:color w:val="2E5E8C"/>
+          <w:sz w:val="19"/>
+        </w:rPr>
+        <w:t>Spectrum (Charter Communications)  |  Town and Country, MO</w:t>
+      </w:r>
+    </w:p>
+    <w:p>
+      <w:pPr>
+        <w:pStyle w:val="ListBullet"/>
+        <w:spacing w:before="0" w:after="40"/>
+        <w:ind w:left="317" w:hanging="230"/>
+      </w:pPr>
+      <w:r>
+        <w:rPr>
+          <w:color w:val="222222"/>
+        </w:rPr>
+        <w:t>Architected and shipped the CM Hub Intel Tool, an end-to-end network intelligence platform that consolidates 3,916 hub records from 6 source systems into a single searchable CMDB used daily by NOC and Change Management teams.</w:t>
+      </w:r>
+    </w:p>
+    <w:p>
+      <w:pPr>
+        <w:pStyle w:val="ListBullet"/>
+        <w:spacing w:before="0" w:after="40"/>
+        <w:ind w:left="317" w:hanging="230"/>
+      </w:pPr>
+      <w:r>
+        <w:rPr>
+          <w:color w:val="222222"/>
+        </w:rPr>
+        <w:t>Wrote T-SQL against the Remedy (NOC_APPS) database to pull hub, node, and device (CMTS/OLT/RDM) data, then built a Python (pandas / openpyxl) pipeline that merges optical transport, single-threaded, and backbone sources into one dataset.</w:t>
+      </w:r>
+    </w:p>
+    <w:p>
+      <w:pPr>
+        <w:pStyle w:val="ListBullet"/>
+        <w:spacing w:before="0" w:after="40"/>
+        <w:ind w:left="317" w:hanging="230"/>
+      </w:pPr>
+      <w:r>
+        <w:rPr>
+          <w:color w:val="222222"/>
+        </w:rPr>
+        <w:t>Developed a two-pass matching engine (exact + vendor-locked fuzzy matching) that links 100+ Visio transport maps to hubs at a 96% match rate, and parsed Visio .vsdx XML to flag 167 backbone (BBoC) hubs and 108 single-threaded sites.</w:t>
+      </w:r>
+    </w:p>
+    <w:p>
+      <w:pPr>
+        <w:pStyle w:val="ListBullet"/>
+        <w:spacing w:before="0" w:after="40"/>
+        <w:ind w:left="317" w:hanging="230"/>
+      </w:pPr>
+      <w:r>
+        <w:rPr>
+          <w:color w:val="222222"/>
+        </w:rPr>
+        <w:t>Built a C# / .NET Microsoft Graph API updater with certificate-based auth, batched parallel writes, and exponential-backoff retry that replaced a 2-hour Power Automate flow with a 5–10 minute upload — cutting the full update cycle from ~2.5 hours to ~20 minutes.</w:t>
+      </w:r>
+    </w:p>
+    <w:p>
+      <w:pPr>
+        <w:pStyle w:val="ListBullet"/>
+        <w:spacing w:before="0" w:after="40"/>
+        <w:ind w:left="317" w:hanging="230"/>
+      </w:pPr>
+      <w:r>
+        <w:rPr>
+          <w:color w:val="222222"/>
+        </w:rPr>
+        <w:t>Delivered the tool through a Power Apps front end on a SharePoint list, added a serverless C# Azure Function for automated Visio splitting, and set up GitLab CI/CD with property-based (Hypothesis) tests to protect data-integrity invariants.</w:t>
+      </w:r>
+    </w:p>
+    <w:p>
+      <w:pPr>
+        <w:tabs>
+          <w:tab w:pos="10224" w:val="right"/>
+        </w:tabs>
+        <w:spacing w:before="140" w:after="0"/>
+      </w:pPr>
+      <w:r>
+        <w:rPr>
+          <w:b/>
+          <w:color w:val="1F2A44"/>
+          <w:sz w:val="22"/>
+        </w:rPr>
         <w:t>Change Analyst II — Change Management &amp; Automation</w:t>
       </w:r>
       <w:r>
@@ -212,7 +315,7 @@
           <w:sz w:val="19"/>
         </w:rPr>
         <w:tab/>
-        <w:t>2018 – Present</w:t>
+        <w:t>2018 – Apr 2026</w:t>
       </w:r>
     </w:p>
     <w:p>

</xml_diff>

<commit_message>
Add Cloud & AWS skills and AWS Cloud Quest training
</commit_message>
<xml_diff>
--- a/Art_Van_de_Riet_Resume_2026.docx
+++ b/Art_Van_de_Riet_Resume_2026.docx
@@ -113,6 +113,25 @@
           <w:color w:val="222222"/>
         </w:rPr>
         <w:t>Python  ·  Power Automate  ·  Power Apps  ·  VBA / Excel Macros  ·  C# / Azure Functions  ·  SharePoint  ·  CI/CD &amp; GitLab Runners</w:t>
+      </w:r>
+    </w:p>
+    <w:p>
+      <w:pPr>
+        <w:spacing w:before="20" w:after="20"/>
+        <w:ind w:left="29"/>
+      </w:pPr>
+      <w:r>
+        <w:rPr>
+          <w:b/>
+          <w:color w:val="2E5E8C"/>
+        </w:rPr>
+        <w:t xml:space="preserve">Cloud &amp; AWS:  </w:t>
+      </w:r>
+      <w:r>
+        <w:rPr>
+          <w:color w:val="222222"/>
+        </w:rPr>
+        <w:t>AWS  ·  EC2  ·  S3  ·  VPC  ·  IAM  ·  Lambda  ·  RDS  ·  DynamoDB  ·  CloudWatch  ·  CloudFormation</w:t>
       </w:r>
     </w:p>
     <w:p>
@@ -946,6 +965,19 @@
         <w:rPr>
           <w:color w:val="222222"/>
         </w:rPr>
+        <w:t>AWS Training: AWS Cloud Quest — Cloud Practitioner (completed); Solutions Architect (in progress).</w:t>
+      </w:r>
+    </w:p>
+    <w:p>
+      <w:pPr>
+        <w:pStyle w:val="ListBullet"/>
+        <w:spacing w:before="0" w:after="40"/>
+        <w:ind w:left="317" w:hanging="230"/>
+      </w:pPr>
+      <w:r>
+        <w:rPr>
+          <w:color w:val="222222"/>
+        </w:rPr>
         <w:t>Professional Development (Udemy): Python (Beginner to Advanced), SQL, Microsoft Access (Beginner to Advanced), Tableau Data Analytics, Analytics Engineering Bootcamp.</w:t>
       </w:r>
     </w:p>

</xml_diff>

<commit_message>
Expand skills with keyword tags grounded in project work
</commit_message>
<xml_diff>
--- a/Art_Van_de_Riet_Resume_2026.docx
+++ b/Art_Van_de_Riet_Resume_2026.docx
@@ -112,7 +112,7 @@
         <w:rPr>
           <w:color w:val="222222"/>
         </w:rPr>
-        <w:t>Python  ·  Power Automate  ·  Power Apps  ·  VBA / Excel Macros  ·  C# / Azure Functions  ·  SharePoint  ·  CI/CD &amp; GitLab Runners</w:t>
+        <w:t>Python  ·  Power Automate  ·  Power Apps  ·  VBA / Excel Macros  ·  C# / .NET  ·  Azure Functions  ·  Microsoft Graph API  ·  REST APIs  ·  SharePoint  ·  Git  ·  CI/CD &amp; GitLab Runners  ·  pytest</w:t>
       </w:r>
     </w:p>
     <w:p>
@@ -131,7 +131,7 @@
         <w:rPr>
           <w:color w:val="222222"/>
         </w:rPr>
-        <w:t>AWS  ·  EC2  ·  S3  ·  VPC  ·  IAM  ·  Lambda  ·  RDS  ·  DynamoDB  ·  CloudWatch  ·  CloudFormation</w:t>
+        <w:t>AWS  ·  EC2  ·  S3  ·  VPC  ·  IAM  ·  Lambda  ·  RDS  ·  DynamoDB  ·  Route 53  ·  CloudFront  ·  Auto Scaling  ·  ELB  ·  SNS  ·  SQS  ·  CloudWatch  ·  CloudFormation</w:t>
       </w:r>
     </w:p>
     <w:p>
@@ -150,7 +150,7 @@
         <w:rPr>
           <w:color w:val="222222"/>
         </w:rPr>
-        <w:t>SQL  ·  Power BI  ·  Tableau  ·  Microsoft Excel &amp; Access  ·  Analytical &amp; Executive Reporting</w:t>
+        <w:t>SQL  ·  T-SQL  ·  pandas  ·  openpyxl  ·  ETL / Data Pipelines  ·  Data Modeling  ·  CMDB  ·  Power BI  ·  Tableau  ·  Microsoft Excel &amp; Access  ·  Executive Reporting</w:t>
       </w:r>
     </w:p>
     <w:p>
@@ -169,7 +169,7 @@
         <w:rPr>
           <w:color w:val="222222"/>
         </w:rPr>
-        <w:t>ITIL Framework  ·  Change &amp; Incident Management  ·  Network Surveillance  ·  Method of Procedure (MOP)  ·  Compliance &amp; Risk</w:t>
+        <w:t>ITIL Framework  ·  Change Management  ·  Incident Management  ·  Problem Management  ·  Root Cause Analysis  ·  Network Surveillance  ·  Method of Procedure (MOP)  ·  Compliance &amp; Risk</w:t>
       </w:r>
     </w:p>
     <w:p>
@@ -188,7 +188,7 @@
         <w:rPr>
           <w:color w:val="222222"/>
         </w:rPr>
-        <w:t>Microsoft 365  ·  BMC Remedy  ·  Jira  ·  Netcool  ·  PowerPoint</w:t>
+        <w:t>Microsoft 365  ·  Azure  ·  SharePoint Online  ·  Visio  ·  GitLab  ·  BMC Remedy  ·  Jira  ·  Netcool  ·  PowerPoint</w:t>
       </w:r>
     </w:p>
     <w:p>

</xml_diff>

<commit_message>
Add Charter TLDP leadership development to education section
</commit_message>
<xml_diff>
--- a/Art_Van_de_Riet_Resume_2026.docx
+++ b/Art_Van_de_Riet_Resume_2026.docx
@@ -952,6 +952,19 @@
         <w:rPr>
           <w:color w:val="222222"/>
         </w:rPr>
+        <w:t>Leadership Development: Charter Communications Technical Leadership Development Program (TLDP) — selected participant, 2026 cohort (8-month cross-functional program: mentoring, DDI leadership modules, and an executive presentation to senior leadership).</w:t>
+      </w:r>
+    </w:p>
+    <w:p>
+      <w:pPr>
+        <w:pStyle w:val="ListBullet"/>
+        <w:spacing w:before="0" w:after="40"/>
+        <w:ind w:left="317" w:hanging="230"/>
+      </w:pPr>
+      <w:r>
+        <w:rPr>
+          <w:color w:val="222222"/>
+        </w:rPr>
         <w:t>SCTE Certifications: DOCSIS Engineering Professional, Broadband Telecommunications Specialist, Understanding Cable Technology.</w:t>
       </w:r>
     </w:p>

</xml_diff>